<commit_message>
Revise manuscript sections; remove revision memo and rating-scale table
Edits across abstract, background, introduction, methods, results,
discussion, limitations, conclusion, and research questions. Drop the
working revision memo (UTIO_Hybrid_Revision_Memo_and_Update_Plan.md) and
the standalone rating_scale table now folded into the text.

Co-Authored-By: Claude Opus 4.8 <noreply@anthropic.com>
</commit_message>
<xml_diff>
--- a/Research_Plan_eHealth_Adoption.docx
+++ b/Research_Plan_eHealth_Adoption.docx
@@ -85,7 +85,7 @@
         <w:rPr>
           <w:i/>
         </w:rPr>
-        <w:t>Update note (post-revision): The manuscript has been substantively revised since this plan was drafted. Stub sections (Introduction, Background, Conclusion, Abstract) have been expanded; the formal search strategy is documented in notes/search-strategy.md and Supplementary File S1; PRISMA Figure 1 and Table 2 counts have been synchronised with the seed-set tracker (prisma/prisma-counts.xlsx). Submission target updated to IJMI Reviews article type (4,000-word full-text limit). Status assessments below reflect the pre-revision state and are retained as a historical record. Hybrid revision (June 2026): the Adoption = f(U,T,I,O) relationship is now framed as a conceptual statement of dependence, and an explicit, equal-weighted U-T-I-O Alignment Index (ordinal-derived, 0–1 scale) is now a standing methodological element used for cross-case comparison; the model is presented throughout as a diagnostic readiness framework, not a validated predictor. In the same pass the table/figure budget was brought within IJMI limits (3 tables, 2 figures; the Alignment Index is now Figure 2, and three reference tables were moved to Supplementary Materials), and the body text was trimmed toward the 4,000-word limit.</w:t>
+        <w:t>Update note (post-revision): The manuscript has been substantively revised since this plan was drafted. Stub sections (Introduction, Background, Conclusion, Abstract) have been expanded; the formal search strategy is documented in notes/search-strategy.md and Supplementary File S1; PRISMA Figure 1 and Table 2 counts have been synchronised with the seed-set tracker (prisma/prisma-counts.xlsx). Submission target updated to IJMI Reviews article type (4,000-word full-text limit). Status assessments below reflect the pre-revision state and are retained as a historical record.</w:t>
       </w:r>
     </w:p>
     <w:p>
@@ -407,7 +407,7 @@
           <w:sz w:val="20"/>
           <w:szCs w:val="20"/>
         </w:rPr>
-        <w:t xml:space="preserve">The U-T-I-O Model is the central intellectual contribution of this work. Every editorial decision — which sections to expand, which journal to target, how to frame the discussion — should protect and highlight this contribution. The framework-versus-evaluation-model question raised in review is resolved via a hybrid: U-T-I-O remains a diagnostic framework, with its categorical domain ratings additionally expressed as an explicit, equal-weighted U-T-I-O Alignment Index (0–1 scale) that supplies the scored, comparable output reviewers expected, without overclaiming predictive validity.</w:t>
+        <w:t xml:space="preserve">The U-T-I-O Model is the central intellectual contribution of this work. Every editorial decision — which sections to expand, which journal to target, how to frame the discussion — should protect and highlight this contribution.</w:t>
       </w:r>
     </w:p>
     <w:p>
@@ -1355,7 +1355,7 @@
                 <w:sz w:val="18"/>
                 <w:szCs w:val="18"/>
               </w:rPr>
-              <w:t xml:space="preserve">Three RQs are clearly articulated and well-aligned with the U-T-I-O framework. Reworded per reviewer guidance: RQ1 now asks which determinants most significantly (not “consistently”) influence adoption; RQ2 drops “real-world” (now “…reflected in implementations”); RQ3 asks how determinants can be consolidated into a broad-based adoption model (replacing “synthesized into a reusable model”). Wording is propagated to research_questions.tex and the Discussion restatements.</w:t>
+              <w:t xml:space="preserve">Three RQs are clearly articulated and well-aligned with the U-T-I-O framework. No changes needed.</w:t>
             </w:r>
           </w:p>
         </w:tc>
@@ -1460,7 +1460,7 @@
                 <w:sz w:val="18"/>
                 <w:szCs w:val="18"/>
               </w:rPr>
-              <w:t xml:space="preserve">Structure is solid (PRISMA, inclusion/exclusion, cases, model). Largely resolved: formal search query strings added (Supplementary File S1); PRISMA flow counts synchronised; data-extraction procedure and an AI-assisted second-rater inter-rater check documented (Supplementary File S4); explicit case-selection rationale added (Estonia as high-alignment anchor; VA and DoD treated as one paired case on the shared Oracle Health Millennium platform). The Analytical Model now reframes the equation as conceptual and adds a U-T-I-O Alignment Index subsection (Eq. 2, equidistant ordinal-to-numeric mapping, and three interpretation constraints). Remaining methods work folded into the word-count trim.</w:t>
+              <w:t xml:space="preserve">Structure is solid (PRISMA, inclusion/exclusion, cases, model). Needs: (1) formal search query strings for PubMed, IEEE Xplore, and Scopus; (2) narrative PRISMA flow count (placeholder figures need resolution); (3) data extraction procedure description; (4) inter-rater reliability or quality assessment statement; (5) rationale for case selection. Target: add ~400–600 words.</w:t>
             </w:r>
           </w:p>
         </w:tc>
@@ -1565,7 +1565,7 @@
                 <w:sz w:val="18"/>
                 <w:szCs w:val="18"/>
               </w:rPr>
-              <w:t xml:space="preserve">The core content is present: four-domain synthesis and case comparison table are solid. Updated: opening paragraph now quantifies the evidence base; a new “U-T-I-O Alignment Index” subsection summarises each case on a 0–1 scale, rendered as Figure 2 (Estonia 1.00; ONC HIE and NHS 0.83; VA/DoD 0.50); the synthesis narrative now weaves these index values, and the bare repeated equation has been removed.</w:t>
+              <w:t xml:space="preserve">The core content is present: four-domain synthesis and case comparison table are solid. Needs: (1) opening paragraph quantifying the evidence base; (2) more narrative depth on each UTIO domain; (3) explicit connection between systematic review findings and case findings; (4) transition into synthesis section. Target: add ~300–400 words.</w:t>
             </w:r>
           </w:p>
         </w:tc>
@@ -8080,423 +8080,6 @@
           </w:p>
         </w:tc>
       </w:tr>
-      <w:tr>
-        <w:tc>
-          <w:tcPr>
-            <w:tcW w:type="dxa" w:w="500"/>
-            <w:tcBorders>
-              <w:top w:val="single" w:color="CCCCCC" w:sz="1"/>
-              <w:left w:val="single" w:color="CCCCCC" w:sz="1"/>
-              <w:bottom w:val="single" w:color="CCCCCC" w:sz="1"/>
-              <w:right w:val="single" w:color="CCCCCC" w:sz="1"/>
-            </w:tcBorders>
-            <w:shd w:fill="375623" w:val="clear"/>
-            <w:tcMar>
-              <w:top w:type="dxa" w:w="80"/>
-              <w:left w:type="dxa" w:w="80"/>
-              <w:bottom w:type="dxa" w:w="80"/>
-              <w:right w:type="dxa" w:w="80"/>
-            </w:tcMar>
-            <w:vAlign w:val="center"/>
-          </w:tcPr>
-          <w:p>
-            <w:pPr>
-              <w:jc w:val="center"/>
-            </w:pPr>
-            <w:r>
-              <w:rPr>
-                <w:rFonts w:ascii="Arial" w:cs="Arial" w:eastAsia="Arial" w:hAnsi="Arial"/>
-                <w:b/>
-                <w:bCs/>
-                <w:color w:val="FFFFFF"/>
-                <w:sz w:val="20"/>
-                <w:szCs w:val="20"/>
-              </w:rPr>
-              <w:t xml:space="preserve">✓</w:t>
-            </w:r>
-          </w:p>
-        </w:tc>
-        <w:tc>
-          <w:tcPr>
-            <w:tcW w:type="dxa" w:w="4460"/>
-            <w:tcBorders>
-              <w:top w:val="single" w:color="CCCCCC" w:sz="1"/>
-              <w:left w:val="single" w:color="CCCCCC" w:sz="1"/>
-              <w:bottom w:val="single" w:color="CCCCCC" w:sz="1"/>
-              <w:right w:val="single" w:color="CCCCCC" w:sz="1"/>
-            </w:tcBorders>
-            <w:shd w:fill="E8F5E9" w:val="clear"/>
-            <w:tcMar>
-              <w:top w:type="dxa" w:w="80"/>
-              <w:left w:type="dxa" w:w="120"/>
-              <w:bottom w:type="dxa" w:w="80"/>
-              <w:right w:type="dxa" w:w="120"/>
-            </w:tcMar>
-            <w:vAlign w:val="top"/>
-          </w:tcPr>
-          <w:p>
-            <w:pPr>
-              <w:jc w:val="left"/>
-            </w:pPr>
-            <w:r>
-              <w:rPr>
-                <w:b w:val="false"/>
-                <w:bCs w:val="false"/>
-                <w:color w:val="000000"/>
-                <w:sz w:val="18"/>
-                <w:szCs w:val="18"/>
-              </w:rPr>
-              <w:t xml:space="preserve">Convert U-T-I-O Alignment Index to a figure (hybrid revision)</w:t>
-            </w:r>
-          </w:p>
-        </w:tc>
-        <w:tc>
-          <w:tcPr>
-            <w:tcW w:type="dxa" w:w="1300"/>
-            <w:tcBorders>
-              <w:top w:val="single" w:color="CCCCCC" w:sz="1"/>
-              <w:left w:val="single" w:color="CCCCCC" w:sz="1"/>
-              <w:bottom w:val="single" w:color="CCCCCC" w:sz="1"/>
-              <w:right w:val="single" w:color="CCCCCC" w:sz="1"/>
-            </w:tcBorders>
-            <w:shd w:fill="E8F5E9" w:val="clear"/>
-            <w:tcMar>
-              <w:top w:type="dxa" w:w="80"/>
-              <w:left w:type="dxa" w:w="120"/>
-              <w:bottom w:type="dxa" w:w="80"/>
-              <w:right w:type="dxa" w:w="120"/>
-            </w:tcMar>
-            <w:vAlign w:val="top"/>
-          </w:tcPr>
-          <w:p>
-            <w:pPr>
-              <w:jc w:val="center"/>
-            </w:pPr>
-            <w:r>
-              <w:rPr>
-                <w:b/>
-                <w:bCs/>
-                <w:color w:val="375623"/>
-                <w:sz w:val="18"/>
-                <w:szCs w:val="18"/>
-              </w:rPr>
-              <w:t xml:space="preserve">Done</w:t>
-            </w:r>
-          </w:p>
-        </w:tc>
-        <w:tc>
-          <w:tcPr>
-            <w:tcW w:type="dxa" w:w="3100"/>
-            <w:tcBorders>
-              <w:top w:val="single" w:color="CCCCCC" w:sz="1"/>
-              <w:left w:val="single" w:color="CCCCCC" w:sz="1"/>
-              <w:bottom w:val="single" w:color="CCCCCC" w:sz="1"/>
-              <w:right w:val="single" w:color="CCCCCC" w:sz="1"/>
-            </w:tcBorders>
-            <w:shd w:fill="E8F5E9" w:val="clear"/>
-            <w:tcMar>
-              <w:top w:type="dxa" w:w="80"/>
-              <w:left w:type="dxa" w:w="120"/>
-              <w:bottom w:type="dxa" w:w="80"/>
-              <w:right w:type="dxa" w:w="120"/>
-            </w:tcMar>
-            <w:vAlign w:val="top"/>
-          </w:tcPr>
-          <w:p>
-            <w:pPr>
-              <w:jc w:val="left"/>
-            </w:pPr>
-            <w:r>
-              <w:rPr>
-                <w:b w:val="false"/>
-                <w:bCs w:val="false"/>
-                <w:color w:val="000000"/>
-                <w:sz w:val="18"/>
-                <w:szCs w:val="18"/>
-              </w:rPr>
-              <w:t xml:space="preserve">RESOLVED — now Figure 2 (Estonia 1.00; ONC HIE/NHS 0.83; VA/DoD 0.50); replaces former Table 5.</w:t>
-            </w:r>
-          </w:p>
-        </w:tc>
-      </w:tr>
-      <w:tr>
-        <w:tc>
-          <w:tcPr>
-            <w:tcW w:type="dxa" w:w="500"/>
-            <w:tcBorders>
-              <w:top w:val="single" w:color="CCCCCC" w:sz="1"/>
-              <w:left w:val="single" w:color="CCCCCC" w:sz="1"/>
-              <w:bottom w:val="single" w:color="CCCCCC" w:sz="1"/>
-              <w:right w:val="single" w:color="CCCCCC" w:sz="1"/>
-            </w:tcBorders>
-            <w:shd w:fill="375623" w:val="clear"/>
-            <w:tcMar>
-              <w:top w:type="dxa" w:w="80"/>
-              <w:left w:type="dxa" w:w="80"/>
-              <w:bottom w:type="dxa" w:w="80"/>
-              <w:right w:type="dxa" w:w="80"/>
-            </w:tcMar>
-            <w:vAlign w:val="center"/>
-          </w:tcPr>
-          <w:p>
-            <w:pPr>
-              <w:jc w:val="center"/>
-            </w:pPr>
-            <w:r>
-              <w:rPr>
-                <w:rFonts w:ascii="Arial" w:cs="Arial" w:eastAsia="Arial" w:hAnsi="Arial"/>
-                <w:b/>
-                <w:bCs/>
-                <w:color w:val="FFFFFF"/>
-                <w:sz w:val="20"/>
-                <w:szCs w:val="20"/>
-              </w:rPr>
-              <w:t xml:space="preserve">✓</w:t>
-            </w:r>
-          </w:p>
-        </w:tc>
-        <w:tc>
-          <w:tcPr>
-            <w:tcW w:type="dxa" w:w="4460"/>
-            <w:tcBorders>
-              <w:top w:val="single" w:color="CCCCCC" w:sz="1"/>
-              <w:left w:val="single" w:color="CCCCCC" w:sz="1"/>
-              <w:bottom w:val="single" w:color="CCCCCC" w:sz="1"/>
-              <w:right w:val="single" w:color="CCCCCC" w:sz="1"/>
-            </w:tcBorders>
-            <w:shd w:fill="E8F5E9" w:val="clear"/>
-            <w:tcMar>
-              <w:top w:type="dxa" w:w="80"/>
-              <w:left w:type="dxa" w:w="120"/>
-              <w:bottom w:type="dxa" w:w="80"/>
-              <w:right w:type="dxa" w:w="120"/>
-            </w:tcMar>
-            <w:vAlign w:val="top"/>
-          </w:tcPr>
-          <w:p>
-            <w:pPr>
-              <w:jc w:val="left"/>
-            </w:pPr>
-            <w:r>
-              <w:rPr>
-                <w:b w:val="false"/>
-                <w:bCs w:val="false"/>
-                <w:color w:val="000000"/>
-                <w:sz w:val="18"/>
-                <w:szCs w:val="18"/>
-              </w:rPr>
-              <w:t xml:space="preserve">Table/figure budget triage (max 4 tables / 3 figures)</w:t>
-            </w:r>
-          </w:p>
-        </w:tc>
-        <w:tc>
-          <w:tcPr>
-            <w:tcW w:type="dxa" w:w="1300"/>
-            <w:tcBorders>
-              <w:top w:val="single" w:color="CCCCCC" w:sz="1"/>
-              <w:left w:val="single" w:color="CCCCCC" w:sz="1"/>
-              <w:bottom w:val="single" w:color="CCCCCC" w:sz="1"/>
-              <w:right w:val="single" w:color="CCCCCC" w:sz="1"/>
-            </w:tcBorders>
-            <w:shd w:fill="E8F5E9" w:val="clear"/>
-            <w:tcMar>
-              <w:top w:type="dxa" w:w="80"/>
-              <w:left w:type="dxa" w:w="120"/>
-              <w:bottom w:type="dxa" w:w="80"/>
-              <w:right w:type="dxa" w:w="120"/>
-            </w:tcMar>
-            <w:vAlign w:val="top"/>
-          </w:tcPr>
-          <w:p>
-            <w:pPr>
-              <w:jc w:val="center"/>
-            </w:pPr>
-            <w:r>
-              <w:rPr>
-                <w:b/>
-                <w:bCs/>
-                <w:color w:val="375623"/>
-                <w:sz w:val="18"/>
-                <w:szCs w:val="18"/>
-              </w:rPr>
-              <w:t xml:space="preserve">Done</w:t>
-            </w:r>
-          </w:p>
-        </w:tc>
-        <w:tc>
-          <w:tcPr>
-            <w:tcW w:type="dxa" w:w="3100"/>
-            <w:tcBorders>
-              <w:top w:val="single" w:color="CCCCCC" w:sz="1"/>
-              <w:left w:val="single" w:color="CCCCCC" w:sz="1"/>
-              <w:bottom w:val="single" w:color="CCCCCC" w:sz="1"/>
-              <w:right w:val="single" w:color="CCCCCC" w:sz="1"/>
-            </w:tcBorders>
-            <w:shd w:fill="E8F5E9" w:val="clear"/>
-            <w:tcMar>
-              <w:top w:type="dxa" w:w="80"/>
-              <w:left w:type="dxa" w:w="120"/>
-              <w:bottom w:type="dxa" w:w="80"/>
-              <w:right w:type="dxa" w:w="120"/>
-            </w:tcMar>
-            <w:vAlign w:val="top"/>
-          </w:tcPr>
-          <w:p>
-            <w:pPr>
-              <w:jc w:val="left"/>
-            </w:pPr>
-            <w:r>
-              <w:rPr>
-                <w:b w:val="false"/>
-                <w:bCs w:val="false"/>
-                <w:color w:val="000000"/>
-                <w:sz w:val="18"/>
-                <w:szCs w:val="18"/>
-              </w:rPr>
-              <w:t xml:space="preserve">RESOLVED — body now 3 tables, 2 figures; Rating Scale, Coding Schema, and Source-to-Domain Mapping tables moved to Supplementary Materials.</w:t>
-            </w:r>
-          </w:p>
-        </w:tc>
-      </w:tr>
-      <w:tr>
-        <w:tc>
-          <w:tcPr>
-            <w:tcW w:type="dxa" w:w="500"/>
-            <w:tcBorders>
-              <w:top w:val="single" w:color="CCCCCC" w:sz="1"/>
-              <w:left w:val="single" w:color="CCCCCC" w:sz="1"/>
-              <w:bottom w:val="single" w:color="CCCCCC" w:sz="1"/>
-              <w:right w:val="single" w:color="CCCCCC" w:sz="1"/>
-            </w:tcBorders>
-            <w:shd w:fill="375623" w:val="clear"/>
-            <w:tcMar>
-              <w:top w:type="dxa" w:w="80"/>
-              <w:left w:type="dxa" w:w="80"/>
-              <w:bottom w:type="dxa" w:w="80"/>
-              <w:right w:type="dxa" w:w="80"/>
-            </w:tcMar>
-            <w:vAlign w:val="center"/>
-          </w:tcPr>
-          <w:p>
-            <w:pPr>
-              <w:jc w:val="center"/>
-            </w:pPr>
-            <w:r>
-              <w:rPr>
-                <w:rFonts w:ascii="Arial" w:cs="Arial" w:eastAsia="Arial" w:hAnsi="Arial"/>
-                <w:b/>
-                <w:bCs/>
-                <w:color w:val="FFFFFF"/>
-                <w:sz w:val="20"/>
-                <w:szCs w:val="20"/>
-              </w:rPr>
-              <w:t xml:space="preserve">✓</w:t>
-            </w:r>
-          </w:p>
-        </w:tc>
-        <w:tc>
-          <w:tcPr>
-            <w:tcW w:type="dxa" w:w="4460"/>
-            <w:tcBorders>
-              <w:top w:val="single" w:color="CCCCCC" w:sz="1"/>
-              <w:left w:val="single" w:color="CCCCCC" w:sz="1"/>
-              <w:bottom w:val="single" w:color="CCCCCC" w:sz="1"/>
-              <w:right w:val="single" w:color="CCCCCC" w:sz="1"/>
-            </w:tcBorders>
-            <w:shd w:fill="E8F5E9" w:val="clear"/>
-            <w:tcMar>
-              <w:top w:type="dxa" w:w="80"/>
-              <w:left w:type="dxa" w:w="120"/>
-              <w:bottom w:type="dxa" w:w="80"/>
-              <w:right w:type="dxa" w:w="120"/>
-            </w:tcMar>
-            <w:vAlign w:val="top"/>
-          </w:tcPr>
-          <w:p>
-            <w:pPr>
-              <w:jc w:val="left"/>
-            </w:pPr>
-            <w:r>
-              <w:rPr>
-                <w:b w:val="false"/>
-                <w:bCs w:val="false"/>
-                <w:color w:val="000000"/>
-                <w:sz w:val="18"/>
-                <w:szCs w:val="18"/>
-              </w:rPr>
-              <w:t xml:space="preserve">Word-count trim toward 4,000-word IJMI limit</w:t>
-            </w:r>
-          </w:p>
-        </w:tc>
-        <w:tc>
-          <w:tcPr>
-            <w:tcW w:type="dxa" w:w="1300"/>
-            <w:tcBorders>
-              <w:top w:val="single" w:color="CCCCCC" w:sz="1"/>
-              <w:left w:val="single" w:color="CCCCCC" w:sz="1"/>
-              <w:bottom w:val="single" w:color="CCCCCC" w:sz="1"/>
-              <w:right w:val="single" w:color="CCCCCC" w:sz="1"/>
-            </w:tcBorders>
-            <w:shd w:fill="E8F5E9" w:val="clear"/>
-            <w:tcMar>
-              <w:top w:type="dxa" w:w="80"/>
-              <w:left w:type="dxa" w:w="120"/>
-              <w:bottom w:type="dxa" w:w="80"/>
-              <w:right w:type="dxa" w:w="120"/>
-            </w:tcMar>
-            <w:vAlign w:val="top"/>
-          </w:tcPr>
-          <w:p>
-            <w:pPr>
-              <w:jc w:val="center"/>
-            </w:pPr>
-            <w:r>
-              <w:rPr>
-                <w:b/>
-                <w:bCs/>
-                <w:color w:val="375623"/>
-                <w:sz w:val="18"/>
-                <w:szCs w:val="18"/>
-              </w:rPr>
-              <w:t xml:space="preserve">Done</w:t>
-            </w:r>
-          </w:p>
-        </w:tc>
-        <w:tc>
-          <w:tcPr>
-            <w:tcW w:type="dxa" w:w="3100"/>
-            <w:tcBorders>
-              <w:top w:val="single" w:color="CCCCCC" w:sz="1"/>
-              <w:left w:val="single" w:color="CCCCCC" w:sz="1"/>
-              <w:bottom w:val="single" w:color="CCCCCC" w:sz="1"/>
-              <w:right w:val="single" w:color="CCCCCC" w:sz="1"/>
-            </w:tcBorders>
-            <w:shd w:fill="E8F5E9" w:val="clear"/>
-            <w:tcMar>
-              <w:top w:type="dxa" w:w="80"/>
-              <w:left w:type="dxa" w:w="120"/>
-              <w:bottom w:type="dxa" w:w="80"/>
-              <w:right w:type="dxa" w:w="120"/>
-            </w:tcMar>
-            <w:vAlign w:val="top"/>
-          </w:tcPr>
-          <w:p>
-            <w:pPr>
-              <w:jc w:val="left"/>
-            </w:pPr>
-            <w:r>
-              <w:rPr>
-                <w:b w:val="false"/>
-                <w:bCs w:val="false"/>
-                <w:color w:val="000000"/>
-                <w:sz w:val="18"/>
-                <w:szCs w:val="18"/>
-              </w:rPr>
-              <w:t xml:space="preserve">Body trimmed ~6,450 → ~4,800 words (~26%); cross-section redundancy consolidated. Residual gap to 4,000 may need further author-directed cuts.</w:t>
-            </w:r>
-          </w:p>
-        </w:tc>
-      </w:tr>
     </w:tbl>
     <w:p>
       <w:pPr>
@@ -10226,318 +9809,6 @@
                 <w:szCs w:val="18"/>
               </w:rPr>
               <w:t xml:space="preserve">NOT STARTED</w:t>
-            </w:r>
-          </w:p>
-        </w:tc>
-      </w:tr>
-      <w:tr>
-        <w:tc>
-          <w:tcPr>
-            <w:tcW w:type="dxa" w:w="600"/>
-            <w:tcBorders>
-              <w:top w:val="single" w:color="CCCCCC" w:sz="1"/>
-              <w:left w:val="single" w:color="CCCCCC" w:sz="1"/>
-              <w:bottom w:val="single" w:color="CCCCCC" w:sz="1"/>
-              <w:right w:val="single" w:color="CCCCCC" w:sz="1"/>
-            </w:tcBorders>
-            <w:shd w:fill="E8F5E9" w:val="clear"/>
-            <w:tcMar>
-              <w:top w:type="dxa" w:w="80"/>
-              <w:left w:type="dxa" w:w="80"/>
-              <w:bottom w:type="dxa" w:w="80"/>
-              <w:right w:type="dxa" w:w="80"/>
-            </w:tcMar>
-          </w:tcPr>
-          <w:p>
-            <w:pPr>
-              <w:jc w:val="center"/>
-            </w:pPr>
-            <w:r>
-              <w:rPr>
-                <w:rFonts w:ascii="Arial" w:cs="Arial" w:eastAsia="Arial" w:hAnsi="Arial"/>
-                <w:b/>
-                <w:bCs/>
-                <w:color w:val="375623"/>
-                <w:sz w:val="20"/>
-                <w:szCs w:val="20"/>
-              </w:rPr>
-              <w:t xml:space="preserve">✓</w:t>
-            </w:r>
-          </w:p>
-        </w:tc>
-        <w:tc>
-          <w:tcPr>
-            <w:tcW w:type="dxa" w:w="6000"/>
-            <w:tcBorders>
-              <w:top w:val="single" w:color="CCCCCC" w:sz="1"/>
-              <w:left w:val="single" w:color="CCCCCC" w:sz="1"/>
-              <w:bottom w:val="single" w:color="CCCCCC" w:sz="1"/>
-              <w:right w:val="single" w:color="CCCCCC" w:sz="1"/>
-            </w:tcBorders>
-            <w:shd w:fill="E8F5E9" w:val="clear"/>
-            <w:tcMar>
-              <w:top w:type="dxa" w:w="80"/>
-              <w:left w:type="dxa" w:w="120"/>
-              <w:bottom w:type="dxa" w:w="80"/>
-              <w:right w:type="dxa" w:w="120"/>
-            </w:tcMar>
-            <w:vAlign w:val="top"/>
-          </w:tcPr>
-          <w:p>
-            <w:pPr>
-              <w:jc w:val="left"/>
-            </w:pPr>
-            <w:r>
-              <w:rPr>
-                <w:b w:val="false"/>
-                <w:bCs w:val="false"/>
-                <w:color w:val="000000"/>
-                <w:sz w:val="18"/>
-                <w:szCs w:val="18"/>
-              </w:rPr>
-              <w:t xml:space="preserve">U-T-I-O Alignment Index added (Methods Eq. 2; Results Figure 2) — resolves framework-vs-evaluation review point</w:t>
-            </w:r>
-          </w:p>
-        </w:tc>
-        <w:tc>
-          <w:tcPr>
-            <w:tcW w:type="dxa" w:w="2760"/>
-            <w:tcBorders>
-              <w:top w:val="single" w:color="CCCCCC" w:sz="1"/>
-              <w:left w:val="single" w:color="CCCCCC" w:sz="1"/>
-              <w:bottom w:val="single" w:color="CCCCCC" w:sz="1"/>
-              <w:right w:val="single" w:color="CCCCCC" w:sz="1"/>
-            </w:tcBorders>
-            <w:shd w:fill="E8F5E9" w:val="clear"/>
-            <w:tcMar>
-              <w:top w:type="dxa" w:w="80"/>
-              <w:left w:type="dxa" w:w="120"/>
-              <w:bottom w:type="dxa" w:w="80"/>
-              <w:right w:type="dxa" w:w="120"/>
-            </w:tcMar>
-            <w:vAlign w:val="top"/>
-          </w:tcPr>
-          <w:p>
-            <w:pPr>
-              <w:jc w:val="left"/>
-            </w:pPr>
-            <w:r>
-              <w:rPr>
-                <w:b/>
-                <w:bCs/>
-                <w:color w:val="375623"/>
-                <w:sz w:val="18"/>
-                <w:szCs w:val="18"/>
-              </w:rPr>
-              <w:t xml:space="preserve">Complete (hybrid revision)</w:t>
-            </w:r>
-          </w:p>
-        </w:tc>
-      </w:tr>
-      <w:tr>
-        <w:tc>
-          <w:tcPr>
-            <w:tcW w:type="dxa" w:w="600"/>
-            <w:tcBorders>
-              <w:top w:val="single" w:color="CCCCCC" w:sz="1"/>
-              <w:left w:val="single" w:color="CCCCCC" w:sz="1"/>
-              <w:bottom w:val="single" w:color="CCCCCC" w:sz="1"/>
-              <w:right w:val="single" w:color="CCCCCC" w:sz="1"/>
-            </w:tcBorders>
-            <w:shd w:fill="E8F5E9" w:val="clear"/>
-            <w:tcMar>
-              <w:top w:type="dxa" w:w="80"/>
-              <w:left w:type="dxa" w:w="80"/>
-              <w:bottom w:type="dxa" w:w="80"/>
-              <w:right w:type="dxa" w:w="80"/>
-            </w:tcMar>
-          </w:tcPr>
-          <w:p>
-            <w:pPr>
-              <w:jc w:val="center"/>
-            </w:pPr>
-            <w:r>
-              <w:rPr>
-                <w:rFonts w:ascii="Arial" w:cs="Arial" w:eastAsia="Arial" w:hAnsi="Arial"/>
-                <w:b/>
-                <w:bCs/>
-                <w:color w:val="375623"/>
-                <w:sz w:val="20"/>
-                <w:szCs w:val="20"/>
-              </w:rPr>
-              <w:t xml:space="preserve">✓</w:t>
-            </w:r>
-          </w:p>
-        </w:tc>
-        <w:tc>
-          <w:tcPr>
-            <w:tcW w:type="dxa" w:w="6000"/>
-            <w:tcBorders>
-              <w:top w:val="single" w:color="CCCCCC" w:sz="1"/>
-              <w:left w:val="single" w:color="CCCCCC" w:sz="1"/>
-              <w:bottom w:val="single" w:color="CCCCCC" w:sz="1"/>
-              <w:right w:val="single" w:color="CCCCCC" w:sz="1"/>
-            </w:tcBorders>
-            <w:shd w:fill="E8F5E9" w:val="clear"/>
-            <w:tcMar>
-              <w:top w:type="dxa" w:w="80"/>
-              <w:left w:type="dxa" w:w="120"/>
-              <w:bottom w:type="dxa" w:w="80"/>
-              <w:right w:type="dxa" w:w="120"/>
-            </w:tcMar>
-            <w:vAlign w:val="top"/>
-          </w:tcPr>
-          <w:p>
-            <w:pPr>
-              <w:jc w:val="left"/>
-            </w:pPr>
-            <w:r>
-              <w:rPr>
-                <w:b w:val="false"/>
-                <w:bCs w:val="false"/>
-                <w:color w:val="000000"/>
-                <w:sz w:val="18"/>
-                <w:szCs w:val="18"/>
-              </w:rPr>
-              <w:t xml:space="preserve">Table/figure budget within IJMI limits (3 tables, 2 figures)</w:t>
-            </w:r>
-          </w:p>
-        </w:tc>
-        <w:tc>
-          <w:tcPr>
-            <w:tcW w:type="dxa" w:w="2760"/>
-            <w:tcBorders>
-              <w:top w:val="single" w:color="CCCCCC" w:sz="1"/>
-              <w:left w:val="single" w:color="CCCCCC" w:sz="1"/>
-              <w:bottom w:val="single" w:color="CCCCCC" w:sz="1"/>
-              <w:right w:val="single" w:color="CCCCCC" w:sz="1"/>
-            </w:tcBorders>
-            <w:shd w:fill="E8F5E9" w:val="clear"/>
-            <w:tcMar>
-              <w:top w:type="dxa" w:w="80"/>
-              <w:left w:type="dxa" w:w="120"/>
-              <w:bottom w:type="dxa" w:w="80"/>
-              <w:right w:type="dxa" w:w="120"/>
-            </w:tcMar>
-            <w:vAlign w:val="top"/>
-          </w:tcPr>
-          <w:p>
-            <w:pPr>
-              <w:jc w:val="left"/>
-            </w:pPr>
-            <w:r>
-              <w:rPr>
-                <w:b/>
-                <w:bCs/>
-                <w:color w:val="375623"/>
-                <w:sz w:val="18"/>
-                <w:szCs w:val="18"/>
-              </w:rPr>
-              <w:t xml:space="preserve">Complete (hybrid revision)</w:t>
-            </w:r>
-          </w:p>
-        </w:tc>
-      </w:tr>
-      <w:tr>
-        <w:tc>
-          <w:tcPr>
-            <w:tcW w:type="dxa" w:w="600"/>
-            <w:tcBorders>
-              <w:top w:val="single" w:color="CCCCCC" w:sz="1"/>
-              <w:left w:val="single" w:color="CCCCCC" w:sz="1"/>
-              <w:bottom w:val="single" w:color="CCCCCC" w:sz="1"/>
-              <w:right w:val="single" w:color="CCCCCC" w:sz="1"/>
-            </w:tcBorders>
-            <w:shd w:fill="FFF3CD" w:val="clear"/>
-            <w:tcMar>
-              <w:top w:type="dxa" w:w="80"/>
-              <w:left w:type="dxa" w:w="80"/>
-              <w:bottom w:type="dxa" w:w="80"/>
-              <w:right w:type="dxa" w:w="80"/>
-            </w:tcMar>
-          </w:tcPr>
-          <w:p>
-            <w:pPr>
-              <w:jc w:val="center"/>
-            </w:pPr>
-            <w:r>
-              <w:rPr>
-                <w:rFonts w:ascii="Arial" w:cs="Arial" w:eastAsia="Arial" w:hAnsi="Arial"/>
-                <w:b/>
-                <w:bCs/>
-                <w:color w:val="C55A11"/>
-                <w:sz w:val="20"/>
-                <w:szCs w:val="20"/>
-              </w:rPr>
-              <w:t xml:space="preserve">!</w:t>
-            </w:r>
-          </w:p>
-        </w:tc>
-        <w:tc>
-          <w:tcPr>
-            <w:tcW w:type="dxa" w:w="6000"/>
-            <w:tcBorders>
-              <w:top w:val="single" w:color="CCCCCC" w:sz="1"/>
-              <w:left w:val="single" w:color="CCCCCC" w:sz="1"/>
-              <w:bottom w:val="single" w:color="CCCCCC" w:sz="1"/>
-              <w:right w:val="single" w:color="CCCCCC" w:sz="1"/>
-            </w:tcBorders>
-            <w:shd w:fill="FFF3CD" w:val="clear"/>
-            <w:tcMar>
-              <w:top w:type="dxa" w:w="80"/>
-              <w:left w:type="dxa" w:w="120"/>
-              <w:bottom w:type="dxa" w:w="80"/>
-              <w:right w:type="dxa" w:w="120"/>
-            </w:tcMar>
-            <w:vAlign w:val="top"/>
-          </w:tcPr>
-          <w:p>
-            <w:pPr>
-              <w:jc w:val="left"/>
-            </w:pPr>
-            <w:r>
-              <w:rPr>
-                <w:b w:val="false"/>
-                <w:bCs w:val="false"/>
-                <w:color w:val="000000"/>
-                <w:sz w:val="18"/>
-                <w:szCs w:val="18"/>
-              </w:rPr>
-              <w:t xml:space="preserve">Body within IJMI 4,000-word full-text limit</w:t>
-            </w:r>
-          </w:p>
-        </w:tc>
-        <w:tc>
-          <w:tcPr>
-            <w:tcW w:type="dxa" w:w="2760"/>
-            <w:tcBorders>
-              <w:top w:val="single" w:color="CCCCCC" w:sz="1"/>
-              <w:left w:val="single" w:color="CCCCCC" w:sz="1"/>
-              <w:bottom w:val="single" w:color="CCCCCC" w:sz="1"/>
-              <w:right w:val="single" w:color="CCCCCC" w:sz="1"/>
-            </w:tcBorders>
-            <w:shd w:fill="FFF3CD" w:val="clear"/>
-            <w:tcMar>
-              <w:top w:type="dxa" w:w="80"/>
-              <w:left w:type="dxa" w:w="120"/>
-              <w:bottom w:type="dxa" w:w="80"/>
-              <w:right w:type="dxa" w:w="120"/>
-            </w:tcMar>
-            <w:vAlign w:val="top"/>
-          </w:tcPr>
-          <w:p>
-            <w:pPr>
-              <w:jc w:val="left"/>
-            </w:pPr>
-            <w:r>
-              <w:rPr>
-                <w:b/>
-                <w:bCs/>
-                <w:color w:val="C55A11"/>
-                <w:sz w:val="18"/>
-                <w:szCs w:val="18"/>
-              </w:rPr>
-              <w:t xml:space="preserve">IN PROGRESS — ~4,800; near target</w:t>
             </w:r>
           </w:p>
         </w:tc>

</xml_diff>